<commit_message>
docs: update CV and profile with verified Learn2Design ranking
</commit_message>
<xml_diff>
--- a/public/sebastian_boehler_cv.docx
+++ b/public/sebastian_boehler_cv.docx
@@ -32,7 +32,11 @@
         <w:t>contact@sebastian-boehler.com · +49 176 98114558</w:t>
       </w:r>
     </w:p>
-    <w:p/>
+    <w:p>
+      <w:pPr>
+        <w:spacing w:before="0" w:after="0" w:line="60" w:lineRule="exact"/>
+      </w:pPr>
+    </w:p>
     <w:p>
       <w:r>
         <w:rPr>
@@ -66,6 +70,9 @@
             <w:tcW w:w="1000" w:type="pct"/>
           </w:tcPr>
           <w:p>
+            <w:pPr>
+              <w:spacing w:after="60" w:line="240" w:lineRule="auto"/>
+            </w:pPr>
             <w:r>
               <w:rPr>
                 <w:rFonts w:ascii="Arial" w:hAnsi="Arial" w:eastAsia="Arial"/>
@@ -80,6 +87,9 @@
             <w:tcW w:w="4000" w:type="pct"/>
           </w:tcPr>
           <w:p>
+            <w:pPr>
+              <w:spacing w:after="60" w:line="240" w:lineRule="auto"/>
+            </w:pPr>
             <w:r>
               <w:rPr>
                 <w:rFonts w:ascii="Arial" w:hAnsi="Arial" w:eastAsia="Arial"/>
@@ -106,6 +116,9 @@
             <w:tcW w:w="1000" w:type="pct"/>
           </w:tcPr>
           <w:p>
+            <w:pPr>
+              <w:spacing w:after="60" w:line="240" w:lineRule="auto"/>
+            </w:pPr>
             <w:r>
               <w:rPr>
                 <w:rFonts w:ascii="Arial" w:hAnsi="Arial" w:eastAsia="Arial"/>
@@ -121,6 +134,7 @@
           </w:tcPr>
           <w:p>
             <w:pPr>
+              <w:spacing w:after="60" w:line="240" w:lineRule="auto"/>
               <w:rPr>
                 <w:b/>
               </w:rPr>
@@ -151,6 +165,9 @@
             <w:tcW w:w="1000" w:type="pct"/>
           </w:tcPr>
           <w:p>
+            <w:pPr>
+              <w:spacing w:after="60" w:line="240" w:lineRule="auto"/>
+            </w:pPr>
             <w:r>
               <w:rPr>
                 <w:rFonts w:ascii="Arial" w:hAnsi="Arial" w:eastAsia="Arial"/>
@@ -165,6 +182,9 @@
             <w:tcW w:w="4000" w:type="pct"/>
           </w:tcPr>
           <w:p>
+            <w:pPr>
+              <w:spacing w:after="60" w:line="240" w:lineRule="auto"/>
+            </w:pPr>
             <w:r>
               <w:rPr>
                 <w:rFonts w:ascii="Arial" w:hAnsi="Arial" w:eastAsia="Arial"/>
@@ -176,8 +196,184 @@
         </w:tc>
       </w:tr>
     </w:tbl>
-    <w:p/>
     <w:p>
+      <w:pPr>
+        <w:spacing w:before="140"/>
+        <w:rPr>
+          <w:b/>
+          <w:bCs/>
+          <w:sz w:val="22"/>
+          <w:szCs w:val="28"/>
+        </w:rPr>
+      </w:pPr>
+      <w:r>
+        <w:rPr>
+          <w:rFonts w:ascii="Arial" w:hAnsi="Arial" w:eastAsia="Arial"/>
+          <w:b/>
+          <w:sz w:val="22"/>
+        </w:rPr>
+        <w:t>Research &amp; Competitions</w:t>
+      </w:r>
+    </w:p>
+    <w:tbl>
+      <w:tblPr>
+        <w:tblW w:w="5000" w:type="pct"/>
+        <w:tblBorders>
+          <w:top w:val="single" w:sz="6" w:space="0" w:color="000000"/>
+          <w:left w:val="single" w:sz="6" w:space="0" w:color="000000"/>
+          <w:bottom w:val="single" w:sz="6" w:space="0" w:color="000000"/>
+          <w:right w:val="single" w:sz="6" w:space="0" w:color="000000"/>
+          <w:insideH w:val="single" w:sz="6" w:space="0" w:color="000000"/>
+          <w:insideV w:val="single" w:sz="6" w:space="0" w:color="000000"/>
+        </w:tblBorders>
+        <w:tblLook w:val="04A0" w:firstRow="1" w:lastRow="0" w:firstColumn="1" w:lastColumn="0" w:noHBand="0" w:noVBand="1"/>
+      </w:tblPr>
+      <w:tblGrid>
+        <w:gridCol w:w="2037"/>
+        <w:gridCol w:w="8147"/>
+      </w:tblGrid>
+      <w:tr>
+        <w:tc>
+          <w:tcPr>
+            <w:tcW w:w="1000" w:type="pct"/>
+          </w:tcPr>
+          <w:p>
+            <w:pPr>
+              <w:spacing w:after="60" w:line="240" w:lineRule="auto"/>
+            </w:pPr>
+            <w:r>
+              <w:rPr>
+                <w:b/>
+              </w:rPr>
+              <w:t>2026</w:t>
+            </w:r>
+          </w:p>
+        </w:tc>
+        <w:tc>
+          <w:tcPr>
+            <w:tcW w:w="4000" w:type="pct"/>
+          </w:tcPr>
+          <w:p>
+            <w:pPr>
+              <w:spacing w:after="60" w:line="240" w:lineRule="auto"/>
+            </w:pPr>
+            <w:r>
+              <w:rPr>
+                <w:b/>
+              </w:rPr>
+              <w:t>Learn2Design 2026 - NeurIPS competition track | 13th of 110</w:t>
+            </w:r>
+            <w:r>
+              <w:br/>
+            </w:r>
+            <w:r>
+              <w:rPr>
+                <w:b w:val="0"/>
+              </w:rPr>
+              <w:t>Developed physics-based optimization methods for gravitational-wave detector design using JAX. Built differometor-fast, an optimized simulator backend. Technical report in preparation.</w:t>
+            </w:r>
+          </w:p>
+        </w:tc>
+      </w:tr>
+      <w:tr>
+        <w:tc>
+          <w:tcPr>
+            <w:tcW w:w="1000" w:type="pct"/>
+          </w:tcPr>
+          <w:p>
+            <w:pPr>
+              <w:spacing w:after="60" w:line="240" w:lineRule="auto"/>
+            </w:pPr>
+            <w:r>
+              <w:rPr>
+                <w:rFonts w:ascii="Arial" w:hAnsi="Arial" w:eastAsia="Arial"/>
+                <w:b/>
+              </w:rPr>
+              <w:t>05/2026</w:t>
+            </w:r>
+          </w:p>
+        </w:tc>
+        <w:tc>
+          <w:tcPr>
+            <w:tcW w:w="4000" w:type="pct"/>
+          </w:tcPr>
+          <w:p>
+            <w:pPr>
+              <w:spacing w:after="60" w:line="240" w:lineRule="auto"/>
+            </w:pPr>
+            <w:r>
+              <w:rPr>
+                <w:rFonts w:ascii="Arial" w:hAnsi="Arial" w:eastAsia="Arial"/>
+                <w:b/>
+              </w:rPr>
+              <w:t>QLoRA Fine-Tuning for Next User Turn Prediction and Multi-Step Dialogue Rollouts</w:t>
+            </w:r>
+            <w:r>
+              <w:br/>
+            </w:r>
+            <w:r>
+              <w:rPr>
+                <w:rFonts w:ascii="Arial" w:hAnsi="Arial" w:eastAsia="Arial"/>
+                <w:b w:val="0"/>
+              </w:rPr>
+              <w:t>IEEE ICETSIS 2026, Manama, Bahrain, pp. 1548-1555. DOI: 10.1109/ICETSIS68266.2026.11549360</w:t>
+            </w:r>
+          </w:p>
+        </w:tc>
+      </w:tr>
+      <w:tr>
+        <w:tc>
+          <w:tcPr>
+            <w:tcW w:w="1000" w:type="pct"/>
+          </w:tcPr>
+          <w:p>
+            <w:pPr>
+              <w:spacing w:after="60" w:line="240" w:lineRule="auto"/>
+            </w:pPr>
+            <w:r>
+              <w:rPr>
+                <w:b/>
+              </w:rPr>
+              <w:t>2026</w:t>
+            </w:r>
+          </w:p>
+        </w:tc>
+        <w:tc>
+          <w:tcPr>
+            <w:tcW w:w="4000" w:type="pct"/>
+          </w:tcPr>
+          <w:p>
+            <w:pPr>
+              <w:spacing w:after="60" w:line="240" w:lineRule="auto"/>
+            </w:pPr>
+            <w:r>
+              <w:rPr>
+                <w:b/>
+              </w:rPr>
+              <w:t>Scientific machine learning challenges</w:t>
+            </w:r>
+            <w:r>
+              <w:br/>
+            </w:r>
+            <w:r>
+              <w:rPr>
+                <w:b w:val="0"/>
+              </w:rPr>
+              <w:t>Neural Interfaces: EEG decoding across sessions and participants. Fusion Equilibrium Challenge: plasma reconstruction from non-magnetic diagnostics. Agenthon: coding, forecasting, simulation and explainability.</w:t>
+            </w:r>
+          </w:p>
+        </w:tc>
+      </w:tr>
+    </w:tbl>
+    <w:p>
+      <w:pPr>
+        <w:spacing w:before="0" w:after="0" w:line="60" w:lineRule="exact"/>
+      </w:pPr>
+    </w:p>
+    <w:p>
+      <w:pPr>
+        <w:spacing w:before="140"/>
+      </w:pPr>
       <w:r>
         <w:rPr>
           <w:rFonts w:ascii="Arial" w:hAnsi="Arial" w:eastAsia="Arial"/>
@@ -211,6 +407,7 @@
           </w:tcPr>
           <w:p>
             <w:pPr>
+              <w:spacing w:after="60" w:line="240" w:lineRule="auto"/>
               <w:rPr>
                 <w:b/>
               </w:rPr>
@@ -230,6 +427,7 @@
           </w:tcPr>
           <w:p>
             <w:pPr>
+              <w:spacing w:after="60" w:line="240" w:lineRule="auto"/>
               <w:rPr>
                 <w:b/>
               </w:rPr>
@@ -260,6 +458,9 @@
             <w:tcW w:w="1000" w:type="pct"/>
           </w:tcPr>
           <w:p>
+            <w:pPr>
+              <w:spacing w:after="60" w:line="240" w:lineRule="auto"/>
+            </w:pPr>
             <w:r>
               <w:rPr>
                 <w:rFonts w:ascii="Arial" w:hAnsi="Arial" w:eastAsia="Arial"/>
@@ -274,6 +475,9 @@
             <w:tcW w:w="4000" w:type="pct"/>
           </w:tcPr>
           <w:p>
+            <w:pPr>
+              <w:spacing w:after="60" w:line="240" w:lineRule="auto"/>
+            </w:pPr>
             <w:r>
               <w:rPr>
                 <w:rFonts w:ascii="Arial" w:hAnsi="Arial" w:eastAsia="Arial"/>
@@ -300,6 +504,9 @@
             <w:tcW w:w="1000" w:type="pct"/>
           </w:tcPr>
           <w:p>
+            <w:pPr>
+              <w:spacing w:after="60" w:line="240" w:lineRule="auto"/>
+            </w:pPr>
             <w:r>
               <w:rPr>
                 <w:rFonts w:ascii="Arial" w:hAnsi="Arial" w:eastAsia="Arial"/>
@@ -314,6 +521,9 @@
             <w:tcW w:w="4000" w:type="pct"/>
           </w:tcPr>
           <w:p>
+            <w:pPr>
+              <w:spacing w:after="60" w:line="240" w:lineRule="auto"/>
+            </w:pPr>
             <w:r>
               <w:rPr>
                 <w:rFonts w:ascii="Arial" w:hAnsi="Arial" w:eastAsia="Arial"/>
@@ -340,6 +550,9 @@
             <w:tcW w:w="1000" w:type="pct"/>
           </w:tcPr>
           <w:p>
+            <w:pPr>
+              <w:spacing w:after="60" w:line="240" w:lineRule="auto"/>
+            </w:pPr>
             <w:r>
               <w:rPr>
                 <w:rFonts w:ascii="Arial" w:hAnsi="Arial" w:eastAsia="Arial"/>
@@ -354,6 +567,9 @@
             <w:tcW w:w="4000" w:type="pct"/>
           </w:tcPr>
           <w:p>
+            <w:pPr>
+              <w:spacing w:after="60" w:line="240" w:lineRule="auto"/>
+            </w:pPr>
             <w:r>
               <w:rPr>
                 <w:rFonts w:ascii="Arial" w:hAnsi="Arial" w:eastAsia="Arial"/>
@@ -370,6 +586,9 @@
             <w:tcW w:w="1000" w:type="pct"/>
           </w:tcPr>
           <w:p>
+            <w:pPr>
+              <w:spacing w:after="60" w:line="240" w:lineRule="auto"/>
+            </w:pPr>
             <w:r>
               <w:rPr>
                 <w:rFonts w:ascii="Arial" w:hAnsi="Arial" w:eastAsia="Arial"/>
@@ -384,6 +603,9 @@
             <w:tcW w:w="4000" w:type="pct"/>
           </w:tcPr>
           <w:p>
+            <w:pPr>
+              <w:spacing w:after="60" w:line="240" w:lineRule="auto"/>
+            </w:pPr>
             <w:r>
               <w:rPr>
                 <w:rFonts w:ascii="Arial" w:hAnsi="Arial" w:eastAsia="Arial"/>
@@ -395,8 +617,15 @@
         </w:tc>
       </w:tr>
     </w:tbl>
-    <w:p/>
     <w:p>
+      <w:pPr>
+        <w:spacing w:before="0" w:after="0" w:line="60" w:lineRule="exact"/>
+      </w:pPr>
+    </w:p>
+    <w:p>
+      <w:pPr>
+        <w:spacing w:before="140"/>
+      </w:pPr>
       <w:r>
         <w:rPr>
           <w:rFonts w:ascii="Arial" w:hAnsi="Arial" w:eastAsia="Arial"/>
@@ -429,6 +658,9 @@
             <w:tcW w:w="1000" w:type="pct"/>
           </w:tcPr>
           <w:p>
+            <w:pPr>
+              <w:spacing w:after="60" w:line="240" w:lineRule="auto"/>
+            </w:pPr>
             <w:r>
               <w:rPr>
                 <w:rFonts w:ascii="Arial" w:hAnsi="Arial" w:eastAsia="Arial"/>
@@ -443,6 +675,9 @@
             <w:tcW w:w="4000" w:type="pct"/>
           </w:tcPr>
           <w:p>
+            <w:pPr>
+              <w:spacing w:after="60" w:line="240" w:lineRule="auto"/>
+            </w:pPr>
             <w:r>
               <w:rPr>
                 <w:rFonts w:ascii="Arial" w:hAnsi="Arial" w:eastAsia="Arial"/>
@@ -469,6 +704,9 @@
             <w:tcW w:w="1000" w:type="pct"/>
           </w:tcPr>
           <w:p>
+            <w:pPr>
+              <w:spacing w:after="60" w:line="240" w:lineRule="auto"/>
+            </w:pPr>
             <w:r>
               <w:rPr>
                 <w:rFonts w:ascii="Arial" w:hAnsi="Arial" w:eastAsia="Arial"/>
@@ -483,6 +721,9 @@
             <w:tcW w:w="4000" w:type="pct"/>
           </w:tcPr>
           <w:p>
+            <w:pPr>
+              <w:spacing w:after="60" w:line="240" w:lineRule="auto"/>
+            </w:pPr>
             <w:r>
               <w:rPr>
                 <w:rFonts w:ascii="Arial" w:hAnsi="Arial" w:eastAsia="Arial"/>
@@ -494,84 +735,16 @@
         </w:tc>
       </w:tr>
     </w:tbl>
-    <w:p/>
     <w:p>
       <w:pPr>
-        <w:rPr>
-          <w:b/>
-          <w:bCs/>
-          <w:sz w:val="22"/>
-          <w:szCs w:val="28"/>
-        </w:rPr>
+        <w:spacing w:before="0" w:after="0" w:line="60" w:lineRule="exact"/>
       </w:pPr>
-      <w:r>
-        <w:rPr>
-          <w:rFonts w:ascii="Arial" w:hAnsi="Arial" w:eastAsia="Arial"/>
-          <w:b/>
-          <w:sz w:val="22"/>
-        </w:rPr>
-        <w:t>Research</w:t>
-      </w:r>
     </w:p>
-    <w:tbl>
-      <w:tblPr>
-        <w:tblW w:w="5000" w:type="pct"/>
-        <w:tblBorders>
-          <w:top w:val="single" w:sz="6" w:space="0" w:color="000000"/>
-          <w:left w:val="single" w:sz="6" w:space="0" w:color="000000"/>
-          <w:bottom w:val="single" w:sz="6" w:space="0" w:color="000000"/>
-          <w:right w:val="single" w:sz="6" w:space="0" w:color="000000"/>
-          <w:insideH w:val="single" w:sz="6" w:space="0" w:color="000000"/>
-          <w:insideV w:val="single" w:sz="6" w:space="0" w:color="000000"/>
-        </w:tblBorders>
-        <w:tblLook w:val="04A0" w:firstRow="1" w:lastRow="0" w:firstColumn="1" w:lastColumn="0" w:noHBand="0" w:noVBand="1"/>
-      </w:tblPr>
-      <w:tblGrid>
-        <w:gridCol w:w="2037"/>
-        <w:gridCol w:w="8147"/>
-      </w:tblGrid>
-      <w:tr>
-        <w:tc>
-          <w:tcPr>
-            <w:tcW w:w="1000" w:type="pct"/>
-          </w:tcPr>
-          <w:p>
-            <w:r>
-              <w:rPr>
-                <w:rFonts w:ascii="Arial" w:hAnsi="Arial" w:eastAsia="Arial"/>
-                <w:b/>
-              </w:rPr>
-              <w:t>05/2026</w:t>
-            </w:r>
-          </w:p>
-        </w:tc>
-        <w:tc>
-          <w:tcPr>
-            <w:tcW w:w="4000" w:type="pct"/>
-          </w:tcPr>
-          <w:p>
-            <w:r>
-              <w:rPr>
-                <w:rFonts w:ascii="Arial" w:hAnsi="Arial" w:eastAsia="Arial"/>
-                <w:b/>
-              </w:rPr>
-              <w:t>QLoRA Fine-Tuning for Next User Turn Prediction and Multi-Step Dialogue Rollouts</w:t>
-            </w:r>
-            <w:r>
-              <w:br/>
-            </w:r>
-            <w:r>
-              <w:rPr>
-                <w:rFonts w:ascii="Arial" w:hAnsi="Arial" w:eastAsia="Arial"/>
-                <w:b w:val="0"/>
-              </w:rPr>
-              <w:t>IEEE ICETSIS 2026, Manama, Bahrain, pp. 1548-1555. DOI: 10.1109/ICETSIS68266.2026.11549360</w:t>
-            </w:r>
-          </w:p>
-        </w:tc>
-      </w:tr>
-    </w:tbl>
-    <w:p/>
+    <w:p>
+      <w:pPr>
+        <w:spacing w:before="0" w:after="0" w:line="60" w:lineRule="exact"/>
+      </w:pPr>
+    </w:p>
     <w:sectPr>
       <w:headerReference w:type="default" r:id="rId8"/>
       <w:pgSz w:w="12240" w:h="15840"/>
@@ -644,11 +817,7 @@
       </w:rPr>
     </w:pPr>
     <w:r>
-      <w:rPr>
-        <w:rFonts w:ascii="Arial" w:hAnsi="Arial" w:eastAsia="Arial"/>
-        <w:b w:val="0"/>
-      </w:rPr>
-      <w:t>Filderstadt, 20 February 2026</w:t>
+      <w:t>Filderstadt, 28 October 2026</w:t>
     </w:r>
   </w:p>
 </w:hdr>

</xml_diff>

<commit_message>
fix: unify CV fonts and add table cell padding
</commit_message>
<xml_diff>
--- a/public/sebastian_boehler_cv.docx
+++ b/public/sebastian_boehler_cv.docx
@@ -68,15 +68,22 @@
         <w:tc>
           <w:tcPr>
             <w:tcW w:w="1000" w:type="pct"/>
+            <w:tcMar>
+              <w:top w:w="100" w:type="dxa"/>
+              <w:bottom w:w="100" w:type="dxa"/>
+              <w:left w:w="120" w:type="dxa"/>
+              <w:right w:w="120" w:type="dxa"/>
+            </w:tcMar>
           </w:tcPr>
           <w:p>
             <w:pPr>
-              <w:spacing w:after="60" w:line="240" w:lineRule="auto"/>
+              <w:spacing w:after="0" w:line="252" w:lineRule="auto" w:before="0"/>
             </w:pPr>
             <w:r>
               <w:rPr>
                 <w:rFonts w:ascii="Arial" w:hAnsi="Arial" w:eastAsia="Arial"/>
                 <w:b/>
+                <w:sz w:val="20"/>
               </w:rPr>
               <w:t>since 10/2025</w:t>
             </w:r>
@@ -85,25 +92,37 @@
         <w:tc>
           <w:tcPr>
             <w:tcW w:w="4000" w:type="pct"/>
+            <w:tcMar>
+              <w:top w:w="100" w:type="dxa"/>
+              <w:bottom w:w="100" w:type="dxa"/>
+              <w:left w:w="120" w:type="dxa"/>
+              <w:right w:w="120" w:type="dxa"/>
+            </w:tcMar>
           </w:tcPr>
           <w:p>
             <w:pPr>
-              <w:spacing w:after="60" w:line="240" w:lineRule="auto"/>
+              <w:spacing w:after="0" w:line="252" w:lineRule="auto" w:before="0"/>
             </w:pPr>
             <w:r>
               <w:rPr>
                 <w:rFonts w:ascii="Arial" w:hAnsi="Arial" w:eastAsia="Arial"/>
                 <w:b/>
+                <w:sz w:val="20"/>
               </w:rPr>
               <w:t>M.Sc. Computer Science - University of Tübingen</w:t>
             </w:r>
             <w:r>
+              <w:rPr>
+                <w:rFonts w:ascii="Arial" w:hAnsi="Arial" w:eastAsia="Arial"/>
+                <w:sz w:val="20"/>
+              </w:rPr>
               <w:br/>
             </w:r>
             <w:r>
               <w:rPr>
                 <w:rFonts w:ascii="Arial" w:hAnsi="Arial" w:eastAsia="Arial"/>
                 <w:b w:val="0"/>
+                <w:sz w:val="20"/>
               </w:rPr>
               <w:t>Deepening theoretical machine learning knowledge</w:t>
             </w:r>
@@ -114,15 +133,22 @@
         <w:tc>
           <w:tcPr>
             <w:tcW w:w="1000" w:type="pct"/>
+            <w:tcMar>
+              <w:top w:w="100" w:type="dxa"/>
+              <w:bottom w:w="100" w:type="dxa"/>
+              <w:left w:w="120" w:type="dxa"/>
+              <w:right w:w="120" w:type="dxa"/>
+            </w:tcMar>
           </w:tcPr>
           <w:p>
             <w:pPr>
-              <w:spacing w:after="60" w:line="240" w:lineRule="auto"/>
+              <w:spacing w:after="0" w:line="252" w:lineRule="auto" w:before="0"/>
             </w:pPr>
             <w:r>
               <w:rPr>
                 <w:rFonts w:ascii="Arial" w:hAnsi="Arial" w:eastAsia="Arial"/>
                 <w:b/>
+                <w:sz w:val="20"/>
               </w:rPr>
               <w:t>10/2024 - 12/2025</w:t>
             </w:r>
@@ -131,10 +157,16 @@
         <w:tc>
           <w:tcPr>
             <w:tcW w:w="4000" w:type="pct"/>
+            <w:tcMar>
+              <w:top w:w="100" w:type="dxa"/>
+              <w:bottom w:w="100" w:type="dxa"/>
+              <w:left w:w="120" w:type="dxa"/>
+              <w:right w:w="120" w:type="dxa"/>
+            </w:tcMar>
           </w:tcPr>
           <w:p>
             <w:pPr>
-              <w:spacing w:after="60" w:line="240" w:lineRule="auto"/>
+              <w:spacing w:after="0" w:line="252" w:lineRule="auto" w:before="0"/>
               <w:rPr>
                 <w:b/>
               </w:rPr>
@@ -143,16 +175,22 @@
               <w:rPr>
                 <w:rFonts w:ascii="Arial" w:hAnsi="Arial" w:eastAsia="Arial"/>
                 <w:b/>
+                <w:sz w:val="20"/>
               </w:rPr>
               <w:t>B.Sc. Computer Science (English) - IU International University of Applied Sciences</w:t>
             </w:r>
             <w:r>
+              <w:rPr>
+                <w:rFonts w:ascii="Arial" w:hAnsi="Arial" w:eastAsia="Arial"/>
+                <w:sz w:val="20"/>
+              </w:rPr>
               <w:br/>
             </w:r>
             <w:r>
               <w:rPr>
                 <w:rFonts w:ascii="Arial" w:hAnsi="Arial" w:eastAsia="Arial"/>
                 <w:b w:val="0"/>
+                <w:sz w:val="20"/>
               </w:rPr>
               <w:t>Computer science degree program, completed in about one year</w:t>
             </w:r>
@@ -163,15 +201,22 @@
         <w:tc>
           <w:tcPr>
             <w:tcW w:w="1000" w:type="pct"/>
+            <w:tcMar>
+              <w:top w:w="100" w:type="dxa"/>
+              <w:bottom w:w="100" w:type="dxa"/>
+              <w:left w:w="120" w:type="dxa"/>
+              <w:right w:w="120" w:type="dxa"/>
+            </w:tcMar>
           </w:tcPr>
           <w:p>
             <w:pPr>
-              <w:spacing w:after="60" w:line="240" w:lineRule="auto"/>
+              <w:spacing w:after="0" w:line="252" w:lineRule="auto" w:before="0"/>
             </w:pPr>
             <w:r>
               <w:rPr>
                 <w:rFonts w:ascii="Arial" w:hAnsi="Arial" w:eastAsia="Arial"/>
                 <w:b/>
+                <w:sz w:val="20"/>
               </w:rPr>
               <w:t>09/2012 - 07/2020</w:t>
             </w:r>
@@ -180,15 +225,22 @@
         <w:tc>
           <w:tcPr>
             <w:tcW w:w="4000" w:type="pct"/>
+            <w:tcMar>
+              <w:top w:w="100" w:type="dxa"/>
+              <w:bottom w:w="100" w:type="dxa"/>
+              <w:left w:w="120" w:type="dxa"/>
+              <w:right w:w="120" w:type="dxa"/>
+            </w:tcMar>
           </w:tcPr>
           <w:p>
             <w:pPr>
-              <w:spacing w:after="60" w:line="240" w:lineRule="auto"/>
+              <w:spacing w:after="0" w:line="252" w:lineRule="auto" w:before="0"/>
             </w:pPr>
             <w:r>
               <w:rPr>
                 <w:rFonts w:ascii="Arial" w:hAnsi="Arial" w:eastAsia="Arial"/>
                 <w:b/>
+                <w:sz w:val="20"/>
               </w:rPr>
               <w:t>Dietrich-Bonhoeffer-Gymnasium</w:t>
             </w:r>
@@ -236,14 +288,22 @@
         <w:tc>
           <w:tcPr>
             <w:tcW w:w="1000" w:type="pct"/>
+            <w:tcMar>
+              <w:top w:w="100" w:type="dxa"/>
+              <w:bottom w:w="100" w:type="dxa"/>
+              <w:left w:w="120" w:type="dxa"/>
+              <w:right w:w="120" w:type="dxa"/>
+            </w:tcMar>
           </w:tcPr>
           <w:p>
             <w:pPr>
-              <w:spacing w:after="60" w:line="240" w:lineRule="auto"/>
+              <w:spacing w:after="0" w:line="252" w:lineRule="auto" w:before="0"/>
             </w:pPr>
             <w:r>
               <w:rPr>
+                <w:rFonts w:ascii="Arial" w:hAnsi="Arial" w:eastAsia="Arial"/>
                 <w:b/>
+                <w:sz w:val="20"/>
               </w:rPr>
               <w:t>2026</w:t>
             </w:r>
@@ -252,23 +312,37 @@
         <w:tc>
           <w:tcPr>
             <w:tcW w:w="4000" w:type="pct"/>
+            <w:tcMar>
+              <w:top w:w="100" w:type="dxa"/>
+              <w:bottom w:w="100" w:type="dxa"/>
+              <w:left w:w="120" w:type="dxa"/>
+              <w:right w:w="120" w:type="dxa"/>
+            </w:tcMar>
           </w:tcPr>
           <w:p>
             <w:pPr>
-              <w:spacing w:after="60" w:line="240" w:lineRule="auto"/>
+              <w:spacing w:after="0" w:line="252" w:lineRule="auto" w:before="0"/>
             </w:pPr>
             <w:r>
               <w:rPr>
+                <w:rFonts w:ascii="Arial" w:hAnsi="Arial" w:eastAsia="Arial"/>
                 <w:b/>
+                <w:sz w:val="20"/>
               </w:rPr>
               <w:t>Learn2Design 2026 - NeurIPS competition track | 13th of 110</w:t>
             </w:r>
             <w:r>
+              <w:rPr>
+                <w:rFonts w:ascii="Arial" w:hAnsi="Arial" w:eastAsia="Arial"/>
+                <w:sz w:val="20"/>
+              </w:rPr>
               <w:br/>
             </w:r>
             <w:r>
               <w:rPr>
+                <w:rFonts w:ascii="Arial" w:hAnsi="Arial" w:eastAsia="Arial"/>
                 <w:b w:val="0"/>
+                <w:sz w:val="20"/>
               </w:rPr>
               <w:t>Developed physics-based optimization methods for gravitational-wave detector design using JAX. Built differometor-fast, an optimized simulator backend. Technical report in preparation.</w:t>
             </w:r>
@@ -279,15 +353,22 @@
         <w:tc>
           <w:tcPr>
             <w:tcW w:w="1000" w:type="pct"/>
+            <w:tcMar>
+              <w:top w:w="100" w:type="dxa"/>
+              <w:bottom w:w="100" w:type="dxa"/>
+              <w:left w:w="120" w:type="dxa"/>
+              <w:right w:w="120" w:type="dxa"/>
+            </w:tcMar>
           </w:tcPr>
           <w:p>
             <w:pPr>
-              <w:spacing w:after="60" w:line="240" w:lineRule="auto"/>
+              <w:spacing w:after="0" w:line="252" w:lineRule="auto" w:before="0"/>
             </w:pPr>
             <w:r>
               <w:rPr>
                 <w:rFonts w:ascii="Arial" w:hAnsi="Arial" w:eastAsia="Arial"/>
                 <w:b/>
+                <w:sz w:val="20"/>
               </w:rPr>
               <w:t>05/2026</w:t>
             </w:r>
@@ -296,25 +377,37 @@
         <w:tc>
           <w:tcPr>
             <w:tcW w:w="4000" w:type="pct"/>
+            <w:tcMar>
+              <w:top w:w="100" w:type="dxa"/>
+              <w:bottom w:w="100" w:type="dxa"/>
+              <w:left w:w="120" w:type="dxa"/>
+              <w:right w:w="120" w:type="dxa"/>
+            </w:tcMar>
           </w:tcPr>
           <w:p>
             <w:pPr>
-              <w:spacing w:after="60" w:line="240" w:lineRule="auto"/>
+              <w:spacing w:after="0" w:line="252" w:lineRule="auto" w:before="0"/>
             </w:pPr>
             <w:r>
               <w:rPr>
                 <w:rFonts w:ascii="Arial" w:hAnsi="Arial" w:eastAsia="Arial"/>
                 <w:b/>
+                <w:sz w:val="20"/>
               </w:rPr>
               <w:t>QLoRA Fine-Tuning for Next User Turn Prediction and Multi-Step Dialogue Rollouts</w:t>
             </w:r>
             <w:r>
+              <w:rPr>
+                <w:rFonts w:ascii="Arial" w:hAnsi="Arial" w:eastAsia="Arial"/>
+                <w:sz w:val="20"/>
+              </w:rPr>
               <w:br/>
             </w:r>
             <w:r>
               <w:rPr>
                 <w:rFonts w:ascii="Arial" w:hAnsi="Arial" w:eastAsia="Arial"/>
                 <w:b w:val="0"/>
+                <w:sz w:val="20"/>
               </w:rPr>
               <w:t>IEEE ICETSIS 2026, Manama, Bahrain, pp. 1548-1555. DOI: 10.1109/ICETSIS68266.2026.11549360</w:t>
             </w:r>
@@ -325,14 +418,22 @@
         <w:tc>
           <w:tcPr>
             <w:tcW w:w="1000" w:type="pct"/>
+            <w:tcMar>
+              <w:top w:w="100" w:type="dxa"/>
+              <w:bottom w:w="100" w:type="dxa"/>
+              <w:left w:w="120" w:type="dxa"/>
+              <w:right w:w="120" w:type="dxa"/>
+            </w:tcMar>
           </w:tcPr>
           <w:p>
             <w:pPr>
-              <w:spacing w:after="60" w:line="240" w:lineRule="auto"/>
+              <w:spacing w:after="0" w:line="252" w:lineRule="auto" w:before="0"/>
             </w:pPr>
             <w:r>
               <w:rPr>
+                <w:rFonts w:ascii="Arial" w:hAnsi="Arial" w:eastAsia="Arial"/>
                 <w:b/>
+                <w:sz w:val="20"/>
               </w:rPr>
               <w:t>2026</w:t>
             </w:r>
@@ -341,23 +442,37 @@
         <w:tc>
           <w:tcPr>
             <w:tcW w:w="4000" w:type="pct"/>
+            <w:tcMar>
+              <w:top w:w="100" w:type="dxa"/>
+              <w:bottom w:w="100" w:type="dxa"/>
+              <w:left w:w="120" w:type="dxa"/>
+              <w:right w:w="120" w:type="dxa"/>
+            </w:tcMar>
           </w:tcPr>
           <w:p>
             <w:pPr>
-              <w:spacing w:after="60" w:line="240" w:lineRule="auto"/>
+              <w:spacing w:after="0" w:line="252" w:lineRule="auto" w:before="0"/>
             </w:pPr>
             <w:r>
               <w:rPr>
+                <w:rFonts w:ascii="Arial" w:hAnsi="Arial" w:eastAsia="Arial"/>
                 <w:b/>
+                <w:sz w:val="20"/>
               </w:rPr>
               <w:t>Scientific machine learning challenges</w:t>
             </w:r>
             <w:r>
+              <w:rPr>
+                <w:rFonts w:ascii="Arial" w:hAnsi="Arial" w:eastAsia="Arial"/>
+                <w:sz w:val="20"/>
+              </w:rPr>
               <w:br/>
             </w:r>
             <w:r>
               <w:rPr>
+                <w:rFonts w:ascii="Arial" w:hAnsi="Arial" w:eastAsia="Arial"/>
                 <w:b w:val="0"/>
+                <w:sz w:val="20"/>
               </w:rPr>
               <w:t>Neural Interfaces: EEG decoding across sessions and participants. Fusion Equilibrium Challenge: plasma reconstruction from non-magnetic diagnostics. Agenthon: coding, forecasting, simulation and explainability.</w:t>
             </w:r>
@@ -404,10 +519,16 @@
         <w:tc>
           <w:tcPr>
             <w:tcW w:w="1000" w:type="pct"/>
+            <w:tcMar>
+              <w:top w:w="100" w:type="dxa"/>
+              <w:bottom w:w="100" w:type="dxa"/>
+              <w:left w:w="120" w:type="dxa"/>
+              <w:right w:w="120" w:type="dxa"/>
+            </w:tcMar>
           </w:tcPr>
           <w:p>
             <w:pPr>
-              <w:spacing w:after="60" w:line="240" w:lineRule="auto"/>
+              <w:spacing w:after="0" w:line="252" w:lineRule="auto" w:before="0"/>
               <w:rPr>
                 <w:b/>
               </w:rPr>
@@ -416,6 +537,7 @@
               <w:rPr>
                 <w:rFonts w:ascii="Arial" w:hAnsi="Arial" w:eastAsia="Arial"/>
                 <w:b/>
+                <w:sz w:val="20"/>
               </w:rPr>
               <w:t>since 05/2025</w:t>
             </w:r>
@@ -424,10 +546,16 @@
         <w:tc>
           <w:tcPr>
             <w:tcW w:w="4000" w:type="pct"/>
+            <w:tcMar>
+              <w:top w:w="100" w:type="dxa"/>
+              <w:bottom w:w="100" w:type="dxa"/>
+              <w:left w:w="120" w:type="dxa"/>
+              <w:right w:w="120" w:type="dxa"/>
+            </w:tcMar>
           </w:tcPr>
           <w:p>
             <w:pPr>
-              <w:spacing w:after="60" w:line="240" w:lineRule="auto"/>
+              <w:spacing w:after="0" w:line="252" w:lineRule="auto" w:before="0"/>
               <w:rPr>
                 <w:b/>
               </w:rPr>
@@ -436,16 +564,22 @@
               <w:rPr>
                 <w:rFonts w:ascii="Arial" w:hAnsi="Arial" w:eastAsia="Arial"/>
                 <w:b/>
+                <w:sz w:val="20"/>
               </w:rPr>
               <w:t>Sunderlabs - Founder</w:t>
             </w:r>
             <w:r>
+              <w:rPr>
+                <w:rFonts w:ascii="Arial" w:hAnsi="Arial" w:eastAsia="Arial"/>
+                <w:sz w:val="20"/>
+              </w:rPr>
               <w:br/>
             </w:r>
             <w:r>
               <w:rPr>
                 <w:rFonts w:ascii="Arial" w:hAnsi="Arial" w:eastAsia="Arial"/>
                 <w:b w:val="0"/>
+                <w:sz w:val="20"/>
               </w:rPr>
               <w:t>Reinforcement learning and NLP research; development of agentic systems</w:t>
             </w:r>
@@ -456,15 +590,22 @@
         <w:tc>
           <w:tcPr>
             <w:tcW w:w="1000" w:type="pct"/>
+            <w:tcMar>
+              <w:top w:w="100" w:type="dxa"/>
+              <w:bottom w:w="100" w:type="dxa"/>
+              <w:left w:w="120" w:type="dxa"/>
+              <w:right w:w="120" w:type="dxa"/>
+            </w:tcMar>
           </w:tcPr>
           <w:p>
             <w:pPr>
-              <w:spacing w:after="60" w:line="240" w:lineRule="auto"/>
+              <w:spacing w:after="0" w:line="252" w:lineRule="auto" w:before="0"/>
             </w:pPr>
             <w:r>
               <w:rPr>
                 <w:rFonts w:ascii="Arial" w:hAnsi="Arial" w:eastAsia="Arial"/>
                 <w:b/>
+                <w:sz w:val="20"/>
               </w:rPr>
               <w:t>since 07/2023</w:t>
             </w:r>
@@ -473,25 +614,37 @@
         <w:tc>
           <w:tcPr>
             <w:tcW w:w="4000" w:type="pct"/>
+            <w:tcMar>
+              <w:top w:w="100" w:type="dxa"/>
+              <w:bottom w:w="100" w:type="dxa"/>
+              <w:left w:w="120" w:type="dxa"/>
+              <w:right w:w="120" w:type="dxa"/>
+            </w:tcMar>
           </w:tcPr>
           <w:p>
             <w:pPr>
-              <w:spacing w:after="60" w:line="240" w:lineRule="auto"/>
+              <w:spacing w:after="0" w:line="252" w:lineRule="auto" w:before="0"/>
             </w:pPr>
             <w:r>
               <w:rPr>
                 <w:rFonts w:ascii="Arial" w:hAnsi="Arial" w:eastAsia="Arial"/>
                 <w:b/>
+                <w:sz w:val="20"/>
               </w:rPr>
               <w:t>HB Capital - Co-Founder</w:t>
             </w:r>
             <w:r>
+              <w:rPr>
+                <w:rFonts w:ascii="Arial" w:hAnsi="Arial" w:eastAsia="Arial"/>
+                <w:sz w:val="20"/>
+              </w:rPr>
               <w:br/>
             </w:r>
             <w:r>
               <w:rPr>
                 <w:rFonts w:ascii="Arial" w:hAnsi="Arial" w:eastAsia="Arial"/>
                 <w:b w:val="0"/>
+                <w:sz w:val="20"/>
               </w:rPr>
               <w:t>Development of trading infrastructure, backtesting systems, and RL environments</w:t>
             </w:r>
@@ -502,15 +655,22 @@
         <w:tc>
           <w:tcPr>
             <w:tcW w:w="1000" w:type="pct"/>
+            <w:tcMar>
+              <w:top w:w="100" w:type="dxa"/>
+              <w:bottom w:w="100" w:type="dxa"/>
+              <w:left w:w="120" w:type="dxa"/>
+              <w:right w:w="120" w:type="dxa"/>
+            </w:tcMar>
           </w:tcPr>
           <w:p>
             <w:pPr>
-              <w:spacing w:after="60" w:line="240" w:lineRule="auto"/>
+              <w:spacing w:after="0" w:line="252" w:lineRule="auto" w:before="0"/>
             </w:pPr>
             <w:r>
               <w:rPr>
                 <w:rFonts w:ascii="Arial" w:hAnsi="Arial" w:eastAsia="Arial"/>
                 <w:b/>
+                <w:sz w:val="20"/>
               </w:rPr>
               <w:t>07/2022 - 07/2023</w:t>
             </w:r>
@@ -519,25 +679,37 @@
         <w:tc>
           <w:tcPr>
             <w:tcW w:w="4000" w:type="pct"/>
+            <w:tcMar>
+              <w:top w:w="100" w:type="dxa"/>
+              <w:bottom w:w="100" w:type="dxa"/>
+              <w:left w:w="120" w:type="dxa"/>
+              <w:right w:w="120" w:type="dxa"/>
+            </w:tcMar>
           </w:tcPr>
           <w:p>
             <w:pPr>
-              <w:spacing w:after="60" w:line="240" w:lineRule="auto"/>
+              <w:spacing w:after="0" w:line="252" w:lineRule="auto" w:before="0"/>
             </w:pPr>
             <w:r>
               <w:rPr>
                 <w:rFonts w:ascii="Arial" w:hAnsi="Arial" w:eastAsia="Arial"/>
                 <w:b/>
+                <w:sz w:val="20"/>
               </w:rPr>
               <w:t>LI.FI - Backend Developer</w:t>
             </w:r>
             <w:r>
+              <w:rPr>
+                <w:rFonts w:ascii="Arial" w:hAnsi="Arial" w:eastAsia="Arial"/>
+                <w:sz w:val="20"/>
+              </w:rPr>
               <w:br/>
             </w:r>
             <w:r>
               <w:rPr>
                 <w:rFonts w:ascii="Arial" w:hAnsi="Arial" w:eastAsia="Arial"/>
                 <w:b w:val="0"/>
+                <w:sz w:val="20"/>
               </w:rPr>
               <w:t>Development of data connectors for on-chain data</w:t>
             </w:r>
@@ -548,15 +720,22 @@
         <w:tc>
           <w:tcPr>
             <w:tcW w:w="1000" w:type="pct"/>
+            <w:tcMar>
+              <w:top w:w="100" w:type="dxa"/>
+              <w:bottom w:w="100" w:type="dxa"/>
+              <w:left w:w="120" w:type="dxa"/>
+              <w:right w:w="120" w:type="dxa"/>
+            </w:tcMar>
           </w:tcPr>
           <w:p>
             <w:pPr>
-              <w:spacing w:after="60" w:line="240" w:lineRule="auto"/>
+              <w:spacing w:after="0" w:line="252" w:lineRule="auto" w:before="0"/>
             </w:pPr>
             <w:r>
               <w:rPr>
                 <w:rFonts w:ascii="Arial" w:hAnsi="Arial" w:eastAsia="Arial"/>
                 <w:b/>
+                <w:sz w:val="20"/>
               </w:rPr>
               <w:t>12/2020 - 05/2021</w:t>
             </w:r>
@@ -565,15 +744,22 @@
         <w:tc>
           <w:tcPr>
             <w:tcW w:w="4000" w:type="pct"/>
+            <w:tcMar>
+              <w:top w:w="100" w:type="dxa"/>
+              <w:bottom w:w="100" w:type="dxa"/>
+              <w:left w:w="120" w:type="dxa"/>
+              <w:right w:w="120" w:type="dxa"/>
+            </w:tcMar>
           </w:tcPr>
           <w:p>
             <w:pPr>
-              <w:spacing w:after="60" w:line="240" w:lineRule="auto"/>
+              <w:spacing w:after="0" w:line="252" w:lineRule="auto" w:before="0"/>
             </w:pPr>
             <w:r>
               <w:rPr>
                 <w:rFonts w:ascii="Arial" w:hAnsi="Arial" w:eastAsia="Arial"/>
                 <w:b/>
+                <w:sz w:val="20"/>
               </w:rPr>
               <w:t>Remotly GmbH - Full-Stack Developer</w:t>
             </w:r>
@@ -584,15 +770,22 @@
         <w:tc>
           <w:tcPr>
             <w:tcW w:w="1000" w:type="pct"/>
+            <w:tcMar>
+              <w:top w:w="100" w:type="dxa"/>
+              <w:bottom w:w="100" w:type="dxa"/>
+              <w:left w:w="120" w:type="dxa"/>
+              <w:right w:w="120" w:type="dxa"/>
+            </w:tcMar>
           </w:tcPr>
           <w:p>
             <w:pPr>
-              <w:spacing w:after="60" w:line="240" w:lineRule="auto"/>
+              <w:spacing w:after="0" w:line="252" w:lineRule="auto" w:before="0"/>
             </w:pPr>
             <w:r>
               <w:rPr>
                 <w:rFonts w:ascii="Arial" w:hAnsi="Arial" w:eastAsia="Arial"/>
                 <w:b/>
+                <w:sz w:val="20"/>
               </w:rPr>
               <w:t>01/2020 - 07/2022</w:t>
             </w:r>
@@ -601,15 +794,22 @@
         <w:tc>
           <w:tcPr>
             <w:tcW w:w="4000" w:type="pct"/>
+            <w:tcMar>
+              <w:top w:w="100" w:type="dxa"/>
+              <w:bottom w:w="100" w:type="dxa"/>
+              <w:left w:w="120" w:type="dxa"/>
+              <w:right w:w="120" w:type="dxa"/>
+            </w:tcMar>
           </w:tcPr>
           <w:p>
             <w:pPr>
-              <w:spacing w:after="60" w:line="240" w:lineRule="auto"/>
+              <w:spacing w:after="0" w:line="252" w:lineRule="auto" w:before="0"/>
             </w:pPr>
             <w:r>
               <w:rPr>
                 <w:rFonts w:ascii="Arial" w:hAnsi="Arial" w:eastAsia="Arial"/>
                 <w:b/>
+                <w:sz w:val="20"/>
               </w:rPr>
               <w:t>Boehler IT Solutions - Freelance Full-Stack Developer</w:t>
             </w:r>
@@ -656,15 +856,22 @@
         <w:tc>
           <w:tcPr>
             <w:tcW w:w="1000" w:type="pct"/>
+            <w:tcMar>
+              <w:top w:w="100" w:type="dxa"/>
+              <w:bottom w:w="100" w:type="dxa"/>
+              <w:left w:w="120" w:type="dxa"/>
+              <w:right w:w="120" w:type="dxa"/>
+            </w:tcMar>
           </w:tcPr>
           <w:p>
             <w:pPr>
-              <w:spacing w:after="60" w:line="240" w:lineRule="auto"/>
+              <w:spacing w:after="0" w:line="252" w:lineRule="auto" w:before="0"/>
             </w:pPr>
             <w:r>
               <w:rPr>
                 <w:rFonts w:ascii="Arial" w:hAnsi="Arial" w:eastAsia="Arial"/>
                 <w:b/>
+                <w:sz w:val="20"/>
               </w:rPr>
               <w:t>05/2018 - 09/2022</w:t>
             </w:r>
@@ -673,25 +880,37 @@
         <w:tc>
           <w:tcPr>
             <w:tcW w:w="4000" w:type="pct"/>
+            <w:tcMar>
+              <w:top w:w="100" w:type="dxa"/>
+              <w:bottom w:w="100" w:type="dxa"/>
+              <w:left w:w="120" w:type="dxa"/>
+              <w:right w:w="120" w:type="dxa"/>
+            </w:tcMar>
           </w:tcPr>
           <w:p>
             <w:pPr>
-              <w:spacing w:after="60" w:line="240" w:lineRule="auto"/>
+              <w:spacing w:after="0" w:line="252" w:lineRule="auto" w:before="0"/>
             </w:pPr>
             <w:r>
               <w:rPr>
                 <w:rFonts w:ascii="Arial" w:hAnsi="Arial" w:eastAsia="Arial"/>
                 <w:b/>
+                <w:sz w:val="20"/>
               </w:rPr>
               <w:t>Youth Council, City of Filderstadt (2 terms)</w:t>
             </w:r>
             <w:r>
+              <w:rPr>
+                <w:rFonts w:ascii="Arial" w:hAnsi="Arial" w:eastAsia="Arial"/>
+                <w:sz w:val="20"/>
+              </w:rPr>
               <w:br/>
             </w:r>
             <w:r>
               <w:rPr>
                 <w:rFonts w:ascii="Arial" w:hAnsi="Arial" w:eastAsia="Arial"/>
                 <w:b w:val="0"/>
+                <w:sz w:val="20"/>
               </w:rPr>
               <w:t>Participated in a youth council for two consecutive terms.</w:t>
             </w:r>
@@ -702,15 +921,22 @@
         <w:tc>
           <w:tcPr>
             <w:tcW w:w="1000" w:type="pct"/>
+            <w:tcMar>
+              <w:top w:w="100" w:type="dxa"/>
+              <w:bottom w:w="100" w:type="dxa"/>
+              <w:left w:w="120" w:type="dxa"/>
+              <w:right w:w="120" w:type="dxa"/>
+            </w:tcMar>
           </w:tcPr>
           <w:p>
             <w:pPr>
-              <w:spacing w:after="60" w:line="240" w:lineRule="auto"/>
+              <w:spacing w:after="0" w:line="252" w:lineRule="auto" w:before="0"/>
             </w:pPr>
             <w:r>
               <w:rPr>
                 <w:rFonts w:ascii="Arial" w:hAnsi="Arial" w:eastAsia="Arial"/>
                 <w:b/>
+                <w:sz w:val="20"/>
               </w:rPr>
               <w:t>2018 - 2019</w:t>
             </w:r>
@@ -719,15 +945,22 @@
         <w:tc>
           <w:tcPr>
             <w:tcW w:w="4000" w:type="pct"/>
+            <w:tcMar>
+              <w:top w:w="100" w:type="dxa"/>
+              <w:bottom w:w="100" w:type="dxa"/>
+              <w:left w:w="120" w:type="dxa"/>
+              <w:right w:w="120" w:type="dxa"/>
+            </w:tcMar>
           </w:tcPr>
           <w:p>
             <w:pPr>
-              <w:spacing w:after="60" w:line="240" w:lineRule="auto"/>
+              <w:spacing w:after="0" w:line="252" w:lineRule="auto" w:before="0"/>
             </w:pPr>
             <w:r>
               <w:rPr>
                 <w:rFonts w:ascii="Arial" w:hAnsi="Arial" w:eastAsia="Arial"/>
                 <w:b/>
+                <w:sz w:val="20"/>
               </w:rPr>
               <w:t>Tennis Coach (Children's Training)</w:t>
             </w:r>

</xml_diff>

<commit_message>
docs: reorder CV research entries by recency
</commit_message>
<xml_diff>
--- a/public/sebastian_boehler_cv.docx
+++ b/public/sebastian_boehler_cv.docx
@@ -370,6 +370,71 @@
                 <w:b/>
                 <w:sz w:val="20"/>
               </w:rPr>
+              <w:t>2026</w:t>
+            </w:r>
+          </w:p>
+        </w:tc>
+        <w:tc>
+          <w:tcPr>
+            <w:tcW w:w="4000" w:type="pct"/>
+            <w:tcMar>
+              <w:top w:w="100" w:type="dxa"/>
+              <w:bottom w:w="100" w:type="dxa"/>
+              <w:left w:w="120" w:type="dxa"/>
+              <w:right w:w="120" w:type="dxa"/>
+            </w:tcMar>
+          </w:tcPr>
+          <w:p>
+            <w:pPr>
+              <w:spacing w:after="0" w:line="252" w:lineRule="auto" w:before="0"/>
+            </w:pPr>
+            <w:r>
+              <w:rPr>
+                <w:rFonts w:ascii="Arial" w:hAnsi="Arial" w:eastAsia="Arial"/>
+                <w:b/>
+                <w:sz w:val="20"/>
+              </w:rPr>
+              <w:t>Scientific machine learning challenges</w:t>
+            </w:r>
+            <w:r>
+              <w:rPr>
+                <w:rFonts w:ascii="Arial" w:hAnsi="Arial" w:eastAsia="Arial"/>
+                <w:sz w:val="20"/>
+              </w:rPr>
+              <w:br/>
+            </w:r>
+            <w:r>
+              <w:rPr>
+                <w:rFonts w:ascii="Arial" w:hAnsi="Arial" w:eastAsia="Arial"/>
+                <w:b w:val="0"/>
+                <w:sz w:val="20"/>
+              </w:rPr>
+              <w:t>Neural Interfaces: EEG decoding across sessions and participants. Fusion Equilibrium Challenge: plasma reconstruction from non-magnetic diagnostics. Agenthon: coding, forecasting, simulation and explainability.</w:t>
+            </w:r>
+          </w:p>
+        </w:tc>
+      </w:tr>
+      <w:tr>
+        <w:tc>
+          <w:tcPr>
+            <w:tcW w:w="1000" w:type="pct"/>
+            <w:tcMar>
+              <w:top w:w="100" w:type="dxa"/>
+              <w:bottom w:w="100" w:type="dxa"/>
+              <w:left w:w="120" w:type="dxa"/>
+              <w:right w:w="120" w:type="dxa"/>
+            </w:tcMar>
+          </w:tcPr>
+          <w:p>
+            <w:pPr>
+              <w:spacing w:after="0" w:line="252" w:lineRule="auto" w:before="0"/>
+            </w:pPr>
+            <w:r>
+              <w:rPr>
+                <w:rFonts w:ascii="Arial" w:hAnsi="Arial" w:eastAsia="Arial"/>
+                <w:b/>
+                <w:sz w:val="20"/>
+              </w:rPr>
               <w:t>05/2026</w:t>
             </w:r>
           </w:p>
@@ -410,71 +475,6 @@
                 <w:sz w:val="20"/>
               </w:rPr>
               <w:t>IEEE ICETSIS 2026, Manama, Bahrain, pp. 1548-1555. DOI: 10.1109/ICETSIS68266.2026.11549360</w:t>
-            </w:r>
-          </w:p>
-        </w:tc>
-      </w:tr>
-      <w:tr>
-        <w:tc>
-          <w:tcPr>
-            <w:tcW w:w="1000" w:type="pct"/>
-            <w:tcMar>
-              <w:top w:w="100" w:type="dxa"/>
-              <w:bottom w:w="100" w:type="dxa"/>
-              <w:left w:w="120" w:type="dxa"/>
-              <w:right w:w="120" w:type="dxa"/>
-            </w:tcMar>
-          </w:tcPr>
-          <w:p>
-            <w:pPr>
-              <w:spacing w:after="0" w:line="252" w:lineRule="auto" w:before="0"/>
-            </w:pPr>
-            <w:r>
-              <w:rPr>
-                <w:rFonts w:ascii="Arial" w:hAnsi="Arial" w:eastAsia="Arial"/>
-                <w:b/>
-                <w:sz w:val="20"/>
-              </w:rPr>
-              <w:t>2026</w:t>
-            </w:r>
-          </w:p>
-        </w:tc>
-        <w:tc>
-          <w:tcPr>
-            <w:tcW w:w="4000" w:type="pct"/>
-            <w:tcMar>
-              <w:top w:w="100" w:type="dxa"/>
-              <w:bottom w:w="100" w:type="dxa"/>
-              <w:left w:w="120" w:type="dxa"/>
-              <w:right w:w="120" w:type="dxa"/>
-            </w:tcMar>
-          </w:tcPr>
-          <w:p>
-            <w:pPr>
-              <w:spacing w:after="0" w:line="252" w:lineRule="auto" w:before="0"/>
-            </w:pPr>
-            <w:r>
-              <w:rPr>
-                <w:rFonts w:ascii="Arial" w:hAnsi="Arial" w:eastAsia="Arial"/>
-                <w:b/>
-                <w:sz w:val="20"/>
-              </w:rPr>
-              <w:t>Scientific machine learning challenges</w:t>
-            </w:r>
-            <w:r>
-              <w:rPr>
-                <w:rFonts w:ascii="Arial" w:hAnsi="Arial" w:eastAsia="Arial"/>
-                <w:sz w:val="20"/>
-              </w:rPr>
-              <w:br/>
-            </w:r>
-            <w:r>
-              <w:rPr>
-                <w:rFonts w:ascii="Arial" w:hAnsi="Arial" w:eastAsia="Arial"/>
-                <w:b w:val="0"/>
-                <w:sz w:val="20"/>
-              </w:rPr>
-              <w:t>Neural Interfaces: EEG decoding across sessions and participants. Fusion Equilibrium Challenge: plasma reconstruction from non-magnetic diagnostics. Agenthon: coding, forecasting, simulation and explainability.</w:t>
             </w:r>
           </w:p>
         </w:tc>

</xml_diff>

<commit_message>
docs: add Hector research assistant role to CV
</commit_message>
<xml_diff>
--- a/public/sebastian_boehler_cv.docx
+++ b/public/sebastian_boehler_cv.docx
@@ -3,6 +3,9 @@
 <w:document xmlns:wpc="http://schemas.microsoft.com/office/word/2010/wordprocessingCanvas" xmlns:cx="http://schemas.microsoft.com/office/drawing/2014/chartex" xmlns:cx1="http://schemas.microsoft.com/office/drawing/2015/9/8/chartex" xmlns:cx2="http://schemas.microsoft.com/office/drawing/2015/10/21/chartex" xmlns:cx3="http://schemas.microsoft.com/office/drawing/2016/5/9/chartex" xmlns:cx4="http://schemas.microsoft.com/office/drawing/2016/5/10/chartex" xmlns:cx5="http://schemas.microsoft.com/office/drawing/2016/5/11/chartex" xmlns:cx6="http://schemas.microsoft.com/office/drawing/2016/5/12/chartex" xmlns:cx7="http://schemas.microsoft.com/office/drawing/2016/5/13/chartex" xmlns:cx8="http://schemas.microsoft.com/office/drawing/2016/5/14/chartex" xmlns:mc="http://schemas.openxmlformats.org/markup-compatibility/2006" xmlns:aink="http://schemas.microsoft.com/office/drawing/2016/ink" xmlns:am3d="http://schemas.microsoft.com/office/drawing/2017/model3d" xmlns:o="urn:schemas-microsoft-com:office:office" xmlns:oel="http://schemas.microsoft.com/office/2019/extlst" xmlns:r="http://schemas.openxmlformats.org/officeDocument/2006/relationships" xmlns:m="http://schemas.openxmlformats.org/officeDocument/2006/math" xmlns:v="urn:schemas-microsoft-com:vml" xmlns:wp14="http://schemas.microsoft.com/office/word/2010/wordprocessingDrawing" xmlns:wp="http://schemas.openxmlformats.org/drawingml/2006/wordprocessingDrawing" xmlns:w10="urn:schemas-microsoft-com:office:word" xmlns:w="http://schemas.openxmlformats.org/wordprocessingml/2006/main" xmlns:w14="http://schemas.microsoft.com/office/word/2010/wordml" xmlns:w15="http://schemas.microsoft.com/office/word/2012/wordml" xmlns:w16cex="http://schemas.microsoft.com/office/word/2018/wordml/cex" xmlns:w16cid="http://schemas.microsoft.com/office/word/2016/wordml/cid" xmlns:w16="http://schemas.microsoft.com/office/word/2018/wordml" xmlns:w16du="http://schemas.microsoft.com/office/word/2023/wordml/word16du" xmlns:w16sdtdh="http://schemas.microsoft.com/office/word/2020/wordml/sdtdatahash" xmlns:w16sdtfl="http://schemas.microsoft.com/office/word/2024/wordml/sdtformatlock" xmlns:w16se="http://schemas.microsoft.com/office/word/2015/wordml/symex" xmlns:wpg="http://schemas.microsoft.com/office/word/2010/wordprocessingGroup" xmlns:wpi="http://schemas.microsoft.com/office/word/2010/wordprocessingInk" xmlns:wne="http://schemas.microsoft.com/office/word/2006/wordml" xmlns:wps="http://schemas.microsoft.com/office/word/2010/wordprocessingShape" mc:Ignorable="w14 w15 w16se w16cid w16 w16cex w16sdtdh w16sdtfl w16du wp14">
   <w:body>
     <w:p>
+      <w:pPr>
+        <w:spacing w:after="80"/>
+      </w:pPr>
       <w:r>
         <w:rPr>
           <w:b/>
@@ -12,6 +15,9 @@
       </w:r>
     </w:p>
     <w:p>
+      <w:pPr>
+        <w:spacing w:after="80"/>
+      </w:pPr>
       <w:r>
         <w:t xml:space="preserve">Rechbergstraße 28 · 70794 </w:t>
       </w:r>
@@ -28,6 +34,9 @@
       </w:r>
     </w:p>
     <w:p>
+      <w:pPr>
+        <w:spacing w:after="80"/>
+      </w:pPr>
       <w:r>
         <w:t>contact@sebastian-boehler.com · +49 176 98114558</w:t>
       </w:r>
@@ -38,6 +47,9 @@
       </w:pPr>
     </w:p>
     <w:p>
+      <w:pPr>
+        <w:spacing w:before="140" w:after="80"/>
+      </w:pPr>
       <w:r>
         <w:rPr>
           <w:rFonts w:ascii="Arial" w:hAnsi="Arial" w:eastAsia="Arial"/>
@@ -250,7 +262,7 @@
     </w:tbl>
     <w:p>
       <w:pPr>
-        <w:spacing w:before="140"/>
+        <w:spacing w:before="140" w:after="80"/>
         <w:rPr>
           <w:b/>
           <w:bCs/>
@@ -487,7 +499,7 @@
     </w:p>
     <w:p>
       <w:pPr>
-        <w:spacing w:before="140"/>
+        <w:spacing w:before="140" w:after="80"/>
       </w:pPr>
       <w:r>
         <w:rPr>
@@ -515,6 +527,62 @@
         <w:gridCol w:w="2037"/>
         <w:gridCol w:w="8147"/>
       </w:tblGrid>
+      <w:tr>
+        <w:tc>
+          <w:tcPr>
+            <w:tcW w:w="1000" w:type="pct"/>
+            <w:tcMar>
+              <w:top w:w="100" w:type="dxa"/>
+              <w:bottom w:w="100" w:type="dxa"/>
+              <w:left w:w="120" w:type="dxa"/>
+              <w:right w:w="120" w:type="dxa"/>
+            </w:tcMar>
+          </w:tcPr>
+          <w:p>
+            <w:pPr>
+              <w:spacing w:after="0" w:line="252" w:lineRule="auto" w:before="0"/>
+              <w:rPr>
+                <w:b/>
+              </w:rPr>
+            </w:pPr>
+            <w:r>
+              <w:rPr>
+                <w:rFonts w:ascii="Arial" w:hAnsi="Arial" w:eastAsia="Arial"/>
+                <w:b/>
+                <w:sz w:val="20"/>
+              </w:rPr>
+              <w:t>since 09/2026</w:t>
+            </w:r>
+          </w:p>
+        </w:tc>
+        <w:tc>
+          <w:tcPr>
+            <w:tcW w:w="4000" w:type="pct"/>
+            <w:tcMar>
+              <w:top w:w="100" w:type="dxa"/>
+              <w:bottom w:w="100" w:type="dxa"/>
+              <w:left w:w="120" w:type="dxa"/>
+              <w:right w:w="120" w:type="dxa"/>
+            </w:tcMar>
+          </w:tcPr>
+          <w:p>
+            <w:pPr>
+              <w:spacing w:after="0" w:line="252" w:lineRule="auto" w:before="0"/>
+              <w:rPr>
+                <w:b/>
+              </w:rPr>
+            </w:pPr>
+            <w:r>
+              <w:rPr>
+                <w:rFonts w:ascii="Arial" w:hAnsi="Arial" w:eastAsia="Arial"/>
+                <w:b/>
+                <w:sz w:val="20"/>
+              </w:rPr>
+              <w:t>Hector Research Institute of Education Sciences and Psychology - Research Assistant</w:t>
+            </w:r>
+          </w:p>
+        </w:tc>
+      </w:tr>
       <w:tr>
         <w:tc>
           <w:tcPr>
@@ -824,7 +892,7 @@
     </w:p>
     <w:p>
       <w:pPr>
-        <w:spacing w:before="140"/>
+        <w:spacing w:before="140" w:after="80"/>
       </w:pPr>
       <w:r>
         <w:rPr>

</xml_diff>